<commit_message>
docs(avg): documenten 1-2 op de PDL-keten + schone tekenversie VWO-docx
- Verwerkingsregister (doc 1): PDL = verwerker, Anthropic/GCP/Workspace (+ straks
  Apple en Play/FCM) = subverwerkers van PDL; alleen Exact Reeleezee rechtstreeks.
  Doorgifte-notitie par. 9 benoemt de contractketen via PDL en SCC-module 3
  (processor-processor) voor de kantoor-klantdata.
- Verwerkers-checklist (doc 2): terminologie + overzicht op de PDL-keten; secties
  A/B/C/D geannoteerd; nieuwe secties E (Apple-DPA, voor iOS-livegang) en
  F (Play/FCM-DPA, voor Android) conform de Bijlage B-invulpunten.
- Doc 7: jurist-notitie-actie afgevinkt (uitgevoerd 2026-08-19); definitieve docx
  opnieuw gegenereerd als schone tekenversie zonder statusnoot (printklaar).
- README + BESLISSINGEN bijgewerkt (open actie documenten 1-2 dicht; rest-open:
  KvK-nummer kantoor + handtekeningen).

Co-Authored-By: Claude Fable 5 <noreply@anthropic.com>
</commit_message>
<xml_diff>
--- a/docs/avg/Verwerkersovereenkomst-PDL-definitief-2026-08-18.docx
+++ b/docs/avg/Verwerkersovereenkomst-PDL-definitief-2026-08-18.docx
@@ -15,105 +15,6 @@
           <w:spacing w:val="0"/>
         </w:rPr>
         <w:t xml:space="preserve">Verwerkersovereenkomst (intra-groep) — Administratiekantoor Nijenhuis ↔ PDL Powerhouse B.V.</w:t>
-      </w:r>
-    </w:p>
-    <w:p>
-      <w:pPr>
-        <w:spacing w:after="293"/>
-      </w:pPr>
-      <w:r>
-        <w:rPr>
-          <w:rFonts w:ascii="Times New Roman" w:hAnsi="Times New Roman" w:cs="Times New Roman"/>
-          <w:sz w:val="29"/>
-          <w:sz-cs w:val="29"/>
-          <w:spacing w:val="0"/>
-        </w:rPr>
-        <w:t xml:space="preserve">✅ </w:t>
-      </w:r>
-      <w:r>
-        <w:rPr>
-          <w:rFonts w:ascii="Times New Roman" w:hAnsi="Times New Roman" w:cs="Times New Roman"/>
-          <w:sz w:val="29"/>
-          <w:sz-cs w:val="29"/>
-          <w:b/>
-          <w:spacing w:val="0"/>
-        </w:rPr>
-        <w:t xml:space="preserve">Ondertekenklaar — versie 2026-08-18</w:t>
-      </w:r>
-      <w:r>
-        <w:rPr>
-          <w:rFonts w:ascii="Times New Roman" w:hAnsi="Times New Roman" w:cs="Times New Roman"/>
-          <w:sz w:val="29"/>
-          <w:sz-cs w:val="29"/>
-          <w:spacing w:val="0"/>
-        </w:rPr>
-        <w:t xml:space="preserve"> (jurist-akkoord op het concept 2026-08-12, vraag 9 van het toetsingsmemo). Het door de jurist meegetoetste invulpunt is in deze versie ingevuld conform de </w:t>
-      </w:r>
-      <w:r>
-        <w:rPr>
-          <w:rFonts w:ascii="Times New Roman" w:hAnsi="Times New Roman" w:cs="Times New Roman"/>
-          <w:sz w:val="29"/>
-          <w:sz-cs w:val="29"/>
-          <w:b/>
-          <w:spacing w:val="0"/>
-        </w:rPr>
-        <w:t xml:space="preserve">feitelijke accountstructuur</w:t>
-      </w:r>
-      <w:r>
-        <w:rPr>
-          <w:rFonts w:ascii="Times New Roman" w:hAnsi="Times New Roman" w:cs="Times New Roman"/>
-          <w:sz w:val="29"/>
-          <w:sz-cs w:val="29"/>
-          <w:spacing w:val="0"/>
-        </w:rPr>
-        <w:t xml:space="preserve">: het Anthropic-API-account (organisatie), het Google Cloud-project, de Google Workspace-omgeving én de Apple Developer- en Google Play-accounts staan op naam van </w:t>
-      </w:r>
-      <w:r>
-        <w:rPr>
-          <w:rFonts w:ascii="Times New Roman" w:hAnsi="Times New Roman" w:cs="Times New Roman"/>
-          <w:sz w:val="29"/>
-          <w:sz-cs w:val="29"/>
-          <w:b/>
-          <w:spacing w:val="0"/>
-        </w:rPr>
-        <w:t xml:space="preserve">PDL Powerhouse B.V.</w:t>
-      </w:r>
-      <w:r>
-        <w:rPr>
-          <w:rFonts w:ascii="Times New Roman" w:hAnsi="Times New Roman" w:cs="Times New Roman"/>
-          <w:sz w:val="29"/>
-          <w:sz-cs w:val="29"/>
-          <w:spacing w:val="0"/>
-        </w:rPr>
-        <w:t xml:space="preserve"> — die partijen staan daarom in Bijlage B als subverwerkers ván PDL. Alleen </w:t>
-      </w:r>
-      <w:r>
-        <w:rPr>
-          <w:rFonts w:ascii="Times New Roman" w:hAnsi="Times New Roman" w:cs="Times New Roman"/>
-          <w:sz w:val="29"/>
-          <w:sz-cs w:val="29"/>
-          <w:b/>
-          <w:spacing w:val="0"/>
-        </w:rPr>
-        <w:t xml:space="preserve">Exact Reeleezee</w:t>
-      </w:r>
-      <w:r>
-        <w:rPr>
-          <w:rFonts w:ascii="Times New Roman" w:hAnsi="Times New Roman" w:cs="Times New Roman"/>
-          <w:sz w:val="29"/>
-          <w:sz-cs w:val="29"/>
-          <w:spacing w:val="0"/>
-        </w:rPr>
-        <w:t xml:space="preserve"> contracteert het kantoor rechtstreeks (bestaande relatie, webservice-logins per administratie) en blijft dus búíten deze overeenkomst (verwerker van Verantwoordelijke, documenten 1–2). ⚠️ Open actie conform de jurist-notitie: documenten 1–2 (verwerkingsregister + verwerkers-checklist) aanpassen op de verhuizing van Anthropic en Google Workspace naar de PDL-keten.</w:t>
-      </w:r>
-      <w:r>
-        <w:rPr>
-          <w:rFonts w:ascii="Times New Roman" w:hAnsi="Times New Roman" w:cs="Times New Roman"/>
-          <w:sz w:val="29"/>
-          <w:sz-cs w:val="29"/>
-          <w:spacing w:val="0"/>
-        </w:rPr>
-        <w:t xml:space="preserve"/>
       </w:r>
     </w:p>
     <w:p>

</xml_diff>